<commit_message>
Clarify Patroni states and configuration notes
</commit_message>
<xml_diff>
--- a/lab1/ЛР1_Отчет.docx
+++ b/lab1/ЛР1_Отчет.docx
@@ -56,7 +56,7 @@
         <w:rPr>
           <w:color w:val="000000"/>
         </w:rPr>
-        <w:t>На ВМ Ubuntu 24.04 запущены два узла PostgreSQL 15 с Patroni, ZooKeeper и HAProxy. pg-master работает как Leader, pg-slave — как Sync Standby. Отставание реплики равно 0.</w:t>
+        <w:t>На ВМ Ubuntu 24.04 запущены два узла PostgreSQL 15 с Patroni, ZooKeeper и HAProxy. pg-master работает как Leader, pg-slave — как Sync Standby. Отставание реплики равно 0. Стенд проверяет отказ узла PostgreSQL; одна ВМ, один ZooKeeper и один HAProxy остаются единичными точками отказа.</w:t>
       </w:r>
     </w:p>
     <w:p>
@@ -444,7 +444,7 @@
         <w:rPr>
           <w:color w:val="000000"/>
         </w:rPr>
-        <w:t>Да. Файлы postgresX.yml копируются в образ через COPY. Для применения изменений нужна команда docker compose up -d --build. Обычный restart образ не пересобирает.</w:t>
+        <w:t>После изменения Dockerfile или скопированных postgresX.yml нужен docker compose up -d --build; restart образ не пересобирает. Параметры bootstrap.dcs задаются при создании кластера; позже их меняют через patronictl edit-config.</w:t>
       </w:r>
     </w:p>
     <w:p>

</xml_diff>